<commit_message>
Cập nhật source code và ảnh, báo cáo
</commit_message>
<xml_diff>
--- a/Cong/BAOCAO.docx
+++ b/Cong/BAOCAO.docx
@@ -847,13 +847,14 @@
       <w:r>
         <w:rPr>
           <w:noProof/>
+          <w:lang w:val="vi-VN"/>
         </w:rPr>
         <w:lastRenderedPageBreak/>
         <w:drawing>
-          <wp:inline distT="0" distB="0" distL="0" distR="0" wp14:anchorId="1436515E" wp14:editId="501FB997">
+          <wp:inline distT="0" distB="0" distL="0" distR="0" wp14:anchorId="275E7839" wp14:editId="509B4E47">
             <wp:extent cx="6115050" cy="5350510"/>
             <wp:effectExtent l="0" t="0" r="6350" b="0"/>
-            <wp:docPr id="1130647577" name="Picture 16"/>
+            <wp:docPr id="882023928" name="Picture 14"/>
             <wp:cNvGraphicFramePr>
               <a:graphicFrameLocks xmlns:a="http://schemas.openxmlformats.org/drawingml/2006/main" noChangeAspect="1"/>
             </wp:cNvGraphicFramePr>
@@ -861,7 +862,7 @@
               <a:graphicData uri="http://schemas.openxmlformats.org/drawingml/2006/picture">
                 <pic:pic xmlns:pic="http://schemas.openxmlformats.org/drawingml/2006/picture">
                   <pic:nvPicPr>
-                    <pic:cNvPr id="1130647577" name="Picture 1130647577"/>
+                    <pic:cNvPr id="882023928" name="Picture 882023928"/>
                     <pic:cNvPicPr/>
                   </pic:nvPicPr>
                   <pic:blipFill>
@@ -923,67 +924,269 @@
     </w:p>
     <w:p>
       <w:pPr>
-        <w:rPr>
-          <w:lang w:val="vi-VN"/>
-        </w:rPr>
-      </w:pPr>
-      <w:r>
-        <w:rPr>
-          <w:lang w:val="vi-VN"/>
-        </w:rPr>
-        <w:t>Với tín hiệu tương tự</w:t>
-      </w:r>
-      <w:r>
-        <w:rPr>
-          <w:lang w:val="vi-VN"/>
-        </w:rPr>
-        <w:t>: Tuần hoàn với chu kỳ 0.2s, có 5 chu kỳ trong 1s</w:t>
-      </w:r>
-    </w:p>
-    <w:p>
-      <w:pPr>
-        <w:rPr>
-          <w:lang w:val="vi-VN"/>
-        </w:rPr>
-      </w:pPr>
-      <w:r>
-        <w:rPr>
-          <w:lang w:val="vi-VN"/>
-        </w:rPr>
-        <w:t>Với tín hiệu số: Không tuần hoàn, chuỗi bit chỉ xuất hiện 1 lần và không có lần nào lặp lại</w:t>
-      </w:r>
-    </w:p>
-    <w:p>
-      <w:pPr>
-        <w:rPr>
-          <w:lang w:val="vi-VN"/>
-        </w:rPr>
-      </w:pPr>
-      <w:r>
-        <w:rPr>
-          <w:lang w:val="vi-VN"/>
-        </w:rPr>
-        <w:t xml:space="preserve">Với tín hiệu tuần hoàn: Tuần hoàn với chu kỳ 0.04s, có 2.5 chu kỳ trong 0.1s </w:t>
-      </w:r>
-      <w:r>
-        <w:rPr>
-          <w:lang w:val="vi-VN"/>
-        </w:rPr>
-        <w:sym w:font="Wingdings" w:char="F0E8"/>
-      </w:r>
-      <w:r>
-        <w:rPr>
-          <w:lang w:val="vi-VN"/>
-        </w:rPr>
-        <w:t xml:space="preserve"> trong 1s sẽ có 25 chu kỳ</w:t>
-      </w:r>
-    </w:p>
-    <w:p>
-      <w:pPr>
-        <w:rPr>
-          <w:lang w:val="vi-VN"/>
-        </w:rPr>
-      </w:pPr>
+        <w:spacing w:before="100" w:beforeAutospacing="1" w:after="100" w:afterAutospacing="1"/>
+        <w:rPr>
+          <w:sz w:val="26"/>
+          <w:szCs w:val="26"/>
+        </w:rPr>
+      </w:pPr>
+      <w:r>
+        <w:rPr>
+          <w:rStyle w:val="Strong"/>
+          <w:b w:val="0"/>
+          <w:bCs w:val="0"/>
+          <w:sz w:val="26"/>
+          <w:szCs w:val="26"/>
+        </w:rPr>
+        <w:t>Tín hiệu tương tự</w:t>
+      </w:r>
+      <w:r>
+        <w:rPr>
+          <w:b/>
+          <w:bCs/>
+          <w:sz w:val="26"/>
+          <w:szCs w:val="26"/>
+        </w:rPr>
+        <w:t xml:space="preserve"> </w:t>
+      </w:r>
+      <w:r>
+        <w:rPr>
+          <w:sz w:val="26"/>
+          <w:szCs w:val="26"/>
+        </w:rPr>
+        <w:t>x(t) = 4 + 0.5</w:t>
+      </w:r>
+      <w:r>
+        <w:rPr>
+          <w:sz w:val="26"/>
+          <w:szCs w:val="26"/>
+          <w:lang w:val="vi-VN"/>
+        </w:rPr>
+        <w:t>*</w:t>
+      </w:r>
+      <w:r>
+        <w:rPr>
+          <w:sz w:val="26"/>
+          <w:szCs w:val="26"/>
+        </w:rPr>
+        <w:t>sin(2π</w:t>
+      </w:r>
+      <w:r>
+        <w:rPr>
+          <w:sz w:val="26"/>
+          <w:szCs w:val="26"/>
+          <w:lang w:val="vi-VN"/>
+        </w:rPr>
+        <w:t>*</w:t>
+      </w:r>
+      <w:r>
+        <w:rPr>
+          <w:sz w:val="26"/>
+          <w:szCs w:val="26"/>
+        </w:rPr>
+        <w:t>3</w:t>
+      </w:r>
+      <w:r>
+        <w:rPr>
+          <w:sz w:val="26"/>
+          <w:szCs w:val="26"/>
+          <w:lang w:val="vi-VN"/>
+        </w:rPr>
+        <w:t>*</w:t>
+      </w:r>
+      <w:r>
+        <w:rPr>
+          <w:sz w:val="26"/>
+          <w:szCs w:val="26"/>
+        </w:rPr>
+        <w:t>t</w:t>
+      </w:r>
+      <w:r>
+        <w:rPr>
+          <w:sz w:val="26"/>
+          <w:szCs w:val="26"/>
+          <w:lang w:val="vi-VN"/>
+        </w:rPr>
+        <w:t>1</w:t>
+      </w:r>
+      <w:r>
+        <w:rPr>
+          <w:sz w:val="26"/>
+          <w:szCs w:val="26"/>
+        </w:rPr>
+        <w:t xml:space="preserve">) + nhiễu: phần tín hiệu chính </w:t>
+      </w:r>
+      <w:r>
+        <w:rPr>
+          <w:rStyle w:val="Strong"/>
+          <w:b w:val="0"/>
+          <w:bCs w:val="0"/>
+          <w:sz w:val="26"/>
+          <w:szCs w:val="26"/>
+        </w:rPr>
+        <w:t>tuần hoàn</w:t>
+      </w:r>
+      <w:r>
+        <w:rPr>
+          <w:sz w:val="26"/>
+          <w:szCs w:val="26"/>
+        </w:rPr>
+        <w:t xml:space="preserve"> với tần số 3 Hz, chu kỳ </w:t>
+      </w:r>
+      <w:r>
+        <w:rPr>
+          <w:rStyle w:val="Strong"/>
+          <w:b w:val="0"/>
+          <w:bCs w:val="0"/>
+          <w:sz w:val="26"/>
+          <w:szCs w:val="26"/>
+        </w:rPr>
+        <w:t>T = 1/3 ≈ 0.33 s</w:t>
+      </w:r>
+      <w:r>
+        <w:rPr>
+          <w:sz w:val="26"/>
+          <w:szCs w:val="26"/>
+        </w:rPr>
+        <w:t xml:space="preserve">. Trong cửa sổ quan sát 0–1 s có </w:t>
+      </w:r>
+      <w:r>
+        <w:rPr>
+          <w:rStyle w:val="Strong"/>
+          <w:b w:val="0"/>
+          <w:bCs w:val="0"/>
+          <w:sz w:val="26"/>
+          <w:szCs w:val="26"/>
+        </w:rPr>
+        <w:t>3 chu kỳ</w:t>
+      </w:r>
+      <w:r>
+        <w:rPr>
+          <w:sz w:val="26"/>
+          <w:szCs w:val="26"/>
+        </w:rPr>
+        <w:t>. Tín hiệu dao động quanh mức một chiều 4 V với biên độ 0.5 V. Thành phần nhiễu Gauss là ngẫu nhiên nên không tuần hoàn; nó chỉ làm đường cong bị răng cưa nhẹ, không làm thay đổi chu kỳ của tín hiệu.</w:t>
+      </w:r>
+    </w:p>
+    <w:p>
+      <w:pPr>
+        <w:spacing w:before="100" w:beforeAutospacing="1" w:after="100" w:afterAutospacing="1"/>
+        <w:rPr>
+          <w:sz w:val="26"/>
+          <w:szCs w:val="26"/>
+        </w:rPr>
+      </w:pPr>
+      <w:r>
+        <w:rPr>
+          <w:rStyle w:val="Strong"/>
+          <w:b w:val="0"/>
+          <w:bCs w:val="0"/>
+          <w:sz w:val="26"/>
+          <w:szCs w:val="26"/>
+        </w:rPr>
+        <w:t>Tín hiệu số</w:t>
+      </w:r>
+      <w:r>
+        <w:rPr>
+          <w:sz w:val="26"/>
+          <w:szCs w:val="26"/>
+        </w:rPr>
+        <w:t xml:space="preserve"> (chuỗi bit 1 1 0 1 0 0 1 0, mỗi bit 50 mẫu): </w:t>
+      </w:r>
+      <w:r>
+        <w:rPr>
+          <w:rStyle w:val="Strong"/>
+          <w:b w:val="0"/>
+          <w:bCs w:val="0"/>
+          <w:sz w:val="26"/>
+          <w:szCs w:val="26"/>
+        </w:rPr>
+        <w:t>không tuần hoàn</w:t>
+      </w:r>
+      <w:r>
+        <w:rPr>
+          <w:sz w:val="26"/>
+          <w:szCs w:val="26"/>
+        </w:rPr>
+        <w:t>, vì chuỗi 8 bit chỉ xuất hiện một lần trong cửa sổ quan sát và không có đoạn nào lặp lại.</w:t>
+      </w:r>
+    </w:p>
+    <w:p>
+      <w:pPr>
+        <w:rPr>
+          <w:sz w:val="26"/>
+          <w:szCs w:val="26"/>
+          <w:lang w:val="vi-VN"/>
+        </w:rPr>
+      </w:pPr>
+      <w:r>
+        <w:rPr>
+          <w:rStyle w:val="Strong"/>
+          <w:b w:val="0"/>
+          <w:bCs w:val="0"/>
+          <w:sz w:val="26"/>
+          <w:szCs w:val="26"/>
+        </w:rPr>
+        <w:t>Sóng răng cưa 25 Hz</w:t>
+      </w:r>
+      <w:r>
+        <w:rPr>
+          <w:sz w:val="26"/>
+          <w:szCs w:val="26"/>
+        </w:rPr>
+        <w:t xml:space="preserve">: </w:t>
+      </w:r>
+      <w:r>
+        <w:rPr>
+          <w:rStyle w:val="Strong"/>
+          <w:b w:val="0"/>
+          <w:bCs w:val="0"/>
+          <w:sz w:val="26"/>
+          <w:szCs w:val="26"/>
+        </w:rPr>
+        <w:t>tuần hoàn</w:t>
+      </w:r>
+      <w:r>
+        <w:rPr>
+          <w:sz w:val="26"/>
+          <w:szCs w:val="26"/>
+        </w:rPr>
+        <w:t xml:space="preserve"> với chu kỳ </w:t>
+      </w:r>
+      <w:r>
+        <w:rPr>
+          <w:rStyle w:val="Strong"/>
+          <w:b w:val="0"/>
+          <w:bCs w:val="0"/>
+          <w:sz w:val="26"/>
+          <w:szCs w:val="26"/>
+        </w:rPr>
+        <w:t>T = 1/25 = 0.04 s</w:t>
+      </w:r>
+      <w:r>
+        <w:rPr>
+          <w:sz w:val="26"/>
+          <w:szCs w:val="26"/>
+        </w:rPr>
+        <w:t xml:space="preserve">. Trong cửa sổ quan sát 0–0.1s có </w:t>
+      </w:r>
+      <w:r>
+        <w:rPr>
+          <w:rStyle w:val="Strong"/>
+          <w:b w:val="0"/>
+          <w:bCs w:val="0"/>
+          <w:sz w:val="26"/>
+          <w:szCs w:val="26"/>
+        </w:rPr>
+        <w:t>2.5 chu kỳ</w:t>
+      </w:r>
+      <w:r>
+        <w:rPr>
+          <w:sz w:val="26"/>
+          <w:szCs w:val="26"/>
+        </w:rPr>
+        <w:t>. Nếu quan sát trong 1 s thì có 25 chu kỳ.</w:t>
+      </w:r>
     </w:p>
     <w:p>
       <w:pPr>
@@ -3344,7 +3547,7 @@
           <w:lang w:val="vi-VN"/>
         </w:rPr>
         <w:drawing>
-          <wp:inline distT="0" distB="0" distL="0" distR="0" wp14:anchorId="62DF1CFB" wp14:editId="2A7E1CE3">
+          <wp:inline distT="0" distB="0" distL="0" distR="0" wp14:anchorId="62DF1CFB" wp14:editId="5657AAA9">
             <wp:extent cx="6115050" cy="5340350"/>
             <wp:effectExtent l="0" t="0" r="6350" b="6350"/>
             <wp:docPr id="1856021041" name="Picture 20"/>
@@ -3944,7 +4147,7 @@
           <w:lang w:val="vi-VN"/>
         </w:rPr>
         <w:drawing>
-          <wp:inline distT="0" distB="0" distL="0" distR="0" wp14:anchorId="25A588B0" wp14:editId="1F480F42">
+          <wp:inline distT="0" distB="0" distL="0" distR="0" wp14:anchorId="25A588B0" wp14:editId="396798A4">
             <wp:extent cx="5717587" cy="4993241"/>
             <wp:effectExtent l="0" t="0" r="0" b="0"/>
             <wp:docPr id="1536078352" name="Picture 23"/>
@@ -4102,7 +4305,7 @@
           <w:lang w:val="vi-VN"/>
         </w:rPr>
         <w:drawing>
-          <wp:inline distT="0" distB="0" distL="0" distR="0" wp14:anchorId="4C6D6A14" wp14:editId="3D19BBD8">
+          <wp:inline distT="0" distB="0" distL="0" distR="0" wp14:anchorId="4C6D6A14" wp14:editId="23100A4B">
             <wp:extent cx="6115050" cy="576580"/>
             <wp:effectExtent l="0" t="0" r="6350" b="0"/>
             <wp:docPr id="2100137638" name="Picture 24"/>
@@ -5546,7 +5749,7 @@
           <w:lang w:val="vi-VN"/>
         </w:rPr>
         <w:drawing>
-          <wp:inline distT="0" distB="0" distL="0" distR="0" wp14:anchorId="63F82F8A" wp14:editId="0C94A20E">
+          <wp:inline distT="0" distB="0" distL="0" distR="0" wp14:anchorId="63F82F8A" wp14:editId="1CC09490">
             <wp:extent cx="4167791" cy="2604977"/>
             <wp:effectExtent l="0" t="0" r="0" b="0"/>
             <wp:docPr id="33475088" name="Picture 27"/>
@@ -5633,7 +5836,7 @@
           <w:lang w:val="vi-VN"/>
         </w:rPr>
         <w:drawing>
-          <wp:inline distT="0" distB="0" distL="0" distR="0" wp14:anchorId="2D3BC440" wp14:editId="53A2188C">
+          <wp:inline distT="0" distB="0" distL="0" distR="0" wp14:anchorId="2D3BC440" wp14:editId="467F4D2D">
             <wp:extent cx="4181850" cy="3136605"/>
             <wp:effectExtent l="0" t="0" r="0" b="635"/>
             <wp:docPr id="827014759" name="Picture 26"/>
@@ -6306,7 +6509,7 @@
           <w:lang w:val="vi-VN"/>
         </w:rPr>
         <w:drawing>
-          <wp:inline distT="0" distB="0" distL="0" distR="0" wp14:anchorId="730D6D49" wp14:editId="68991406">
+          <wp:inline distT="0" distB="0" distL="0" distR="0" wp14:anchorId="730D6D49" wp14:editId="49EA8F11">
             <wp:extent cx="6115050" cy="548640"/>
             <wp:effectExtent l="0" t="0" r="6350" b="0"/>
             <wp:docPr id="80466788" name="Picture 29"/>
@@ -7939,7 +8142,7 @@
         </w:rPr>
         <w:lastRenderedPageBreak/>
         <w:drawing>
-          <wp:inline distT="0" distB="0" distL="0" distR="0" wp14:anchorId="37628BCE" wp14:editId="417CB784">
+          <wp:inline distT="0" distB="0" distL="0" distR="0" wp14:anchorId="37628BCE" wp14:editId="776A73D4">
             <wp:extent cx="6115050" cy="2100580"/>
             <wp:effectExtent l="0" t="0" r="6350" b="0"/>
             <wp:docPr id="559138209" name="Picture 14"/>
@@ -8214,15 +8417,7 @@
                 <w:szCs w:val="26"/>
                 <w:lang w:val="vi-VN"/>
               </w:rPr>
-              <w:t>2.13</w:t>
-            </w:r>
-            <w:r>
-              <w:rPr>
-                <w:sz w:val="26"/>
-                <w:szCs w:val="26"/>
-                <w:lang w:val="vi-VN"/>
-              </w:rPr>
-              <w:t>x10</w:t>
+              <w:t>2.13x10</w:t>
             </w:r>
             <w:r>
               <w:rPr>
@@ -8302,15 +8497,7 @@
                 <w:szCs w:val="26"/>
                 <w:lang w:val="vi-VN"/>
               </w:rPr>
-              <w:t>1.91</w:t>
-            </w:r>
-            <w:r>
-              <w:rPr>
-                <w:sz w:val="26"/>
-                <w:szCs w:val="26"/>
-                <w:lang w:val="vi-VN"/>
-              </w:rPr>
-              <w:t>x10</w:t>
+              <w:t>1.91x10</w:t>
             </w:r>
             <w:r>
               <w:rPr>
@@ -8342,15 +8529,7 @@
                 <w:szCs w:val="26"/>
                 <w:lang w:val="vi-VN"/>
               </w:rPr>
-              <w:t>1.86</w:t>
-            </w:r>
-            <w:r>
-              <w:rPr>
-                <w:sz w:val="26"/>
-                <w:szCs w:val="26"/>
-                <w:lang w:val="vi-VN"/>
-              </w:rPr>
-              <w:t>x10</w:t>
+              <w:t>1.86x10</w:t>
             </w:r>
             <w:r>
               <w:rPr>
@@ -8430,15 +8609,7 @@
                 <w:szCs w:val="26"/>
                 <w:lang w:val="vi-VN"/>
               </w:rPr>
-              <w:t>1.58x</w:t>
-            </w:r>
-            <w:r>
-              <w:rPr>
-                <w:sz w:val="26"/>
-                <w:szCs w:val="26"/>
-                <w:lang w:val="vi-VN"/>
-              </w:rPr>
-              <w:t>10</w:t>
+              <w:t>1.58x10</w:t>
             </w:r>
             <w:r>
               <w:rPr>
@@ -8470,15 +8641,7 @@
                 <w:szCs w:val="26"/>
                 <w:lang w:val="vi-VN"/>
               </w:rPr>
-              <w:t>1.58</w:t>
-            </w:r>
-            <w:r>
-              <w:rPr>
-                <w:sz w:val="26"/>
-                <w:szCs w:val="26"/>
-                <w:lang w:val="vi-VN"/>
-              </w:rPr>
-              <w:t>x10</w:t>
+              <w:t>1.58x10</w:t>
             </w:r>
             <w:r>
               <w:rPr>
@@ -8558,15 +8721,7 @@
                 <w:szCs w:val="26"/>
                 <w:lang w:val="vi-VN"/>
               </w:rPr>
-              <w:t>1.32</w:t>
-            </w:r>
-            <w:r>
-              <w:rPr>
-                <w:sz w:val="26"/>
-                <w:szCs w:val="26"/>
-                <w:lang w:val="vi-VN"/>
-              </w:rPr>
-              <w:t>x10</w:t>
+              <w:t>1.32x10</w:t>
             </w:r>
             <w:r>
               <w:rPr>
@@ -8598,15 +8753,7 @@
                 <w:szCs w:val="26"/>
                 <w:lang w:val="vi-VN"/>
               </w:rPr>
-              <w:t>1.3</w:t>
-            </w:r>
-            <w:r>
-              <w:rPr>
-                <w:sz w:val="26"/>
-                <w:szCs w:val="26"/>
-                <w:lang w:val="vi-VN"/>
-              </w:rPr>
-              <w:t>x10</w:t>
+              <w:t>1.3x10</w:t>
             </w:r>
             <w:r>
               <w:rPr>
@@ -8686,15 +8833,7 @@
                 <w:szCs w:val="26"/>
                 <w:lang w:val="vi-VN"/>
               </w:rPr>
-              <w:t>1.01</w:t>
-            </w:r>
-            <w:r>
-              <w:rPr>
-                <w:sz w:val="26"/>
-                <w:szCs w:val="26"/>
-                <w:lang w:val="vi-VN"/>
-              </w:rPr>
-              <w:t>x10</w:t>
+              <w:t>1.01x10</w:t>
             </w:r>
             <w:r>
               <w:rPr>
@@ -8726,15 +8865,7 @@
                 <w:szCs w:val="26"/>
                 <w:lang w:val="vi-VN"/>
               </w:rPr>
-              <w:t>1.03</w:t>
-            </w:r>
-            <w:r>
-              <w:rPr>
-                <w:sz w:val="26"/>
-                <w:szCs w:val="26"/>
-                <w:lang w:val="vi-VN"/>
-              </w:rPr>
-              <w:t>x10</w:t>
+              <w:t>1.03x10</w:t>
             </w:r>
             <w:r>
               <w:rPr>
@@ -8814,15 +8945,7 @@
                 <w:szCs w:val="26"/>
                 <w:lang w:val="vi-VN"/>
               </w:rPr>
-              <w:t>7.71</w:t>
-            </w:r>
-            <w:r>
-              <w:rPr>
-                <w:sz w:val="26"/>
-                <w:szCs w:val="26"/>
-                <w:lang w:val="vi-VN"/>
-              </w:rPr>
-              <w:t>x10</w:t>
+              <w:t>7.71x10</w:t>
             </w:r>
             <w:r>
               <w:rPr>
@@ -8831,7 +8954,30 @@
                 <w:vertAlign w:val="superscript"/>
                 <w:lang w:val="vi-VN"/>
               </w:rPr>
-              <w:t>-</w:t>
+              <w:t>-2</w:t>
+            </w:r>
+          </w:p>
+        </w:tc>
+        <w:tc>
+          <w:tcPr>
+            <w:tcW w:w="2405" w:type="dxa"/>
+          </w:tcPr>
+          <w:p>
+            <w:pPr>
+              <w:jc w:val="center"/>
+              <w:rPr>
+                <w:sz w:val="26"/>
+                <w:szCs w:val="26"/>
+                <w:lang w:val="vi-VN"/>
+              </w:rPr>
+            </w:pPr>
+            <w:r>
+              <w:rPr>
+                <w:sz w:val="26"/>
+                <w:szCs w:val="26"/>
+                <w:lang w:val="vi-VN"/>
+              </w:rPr>
+              <w:t>7.84x10</w:t>
             </w:r>
             <w:r>
               <w:rPr>
@@ -8840,56 +8986,7 @@
                 <w:vertAlign w:val="superscript"/>
                 <w:lang w:val="vi-VN"/>
               </w:rPr>
-              <w:t>2</w:t>
-            </w:r>
-          </w:p>
-        </w:tc>
-        <w:tc>
-          <w:tcPr>
-            <w:tcW w:w="2405" w:type="dxa"/>
-          </w:tcPr>
-          <w:p>
-            <w:pPr>
-              <w:jc w:val="center"/>
-              <w:rPr>
-                <w:sz w:val="26"/>
-                <w:szCs w:val="26"/>
-                <w:lang w:val="vi-VN"/>
-              </w:rPr>
-            </w:pPr>
-            <w:r>
-              <w:rPr>
-                <w:sz w:val="26"/>
-                <w:szCs w:val="26"/>
-                <w:lang w:val="vi-VN"/>
-              </w:rPr>
-              <w:t>7.84</w:t>
-            </w:r>
-            <w:r>
-              <w:rPr>
-                <w:sz w:val="26"/>
-                <w:szCs w:val="26"/>
-                <w:lang w:val="vi-VN"/>
-              </w:rPr>
-              <w:t>x10</w:t>
-            </w:r>
-            <w:r>
-              <w:rPr>
-                <w:sz w:val="26"/>
-                <w:szCs w:val="26"/>
-                <w:vertAlign w:val="superscript"/>
-                <w:lang w:val="vi-VN"/>
-              </w:rPr>
-              <w:t>-</w:t>
-            </w:r>
-            <w:r>
-              <w:rPr>
-                <w:sz w:val="26"/>
-                <w:szCs w:val="26"/>
-                <w:vertAlign w:val="superscript"/>
-                <w:lang w:val="vi-VN"/>
-              </w:rPr>
-              <w:t>2</w:t>
+              <w:t>-2</w:t>
             </w:r>
           </w:p>
         </w:tc>
@@ -8960,15 +9057,7 @@
                 <w:szCs w:val="26"/>
                 <w:lang w:val="vi-VN"/>
               </w:rPr>
-              <w:t>5.56</w:t>
-            </w:r>
-            <w:r>
-              <w:rPr>
-                <w:sz w:val="26"/>
-                <w:szCs w:val="26"/>
-                <w:lang w:val="vi-VN"/>
-              </w:rPr>
-              <w:t>x10</w:t>
+              <w:t>5.56x10</w:t>
             </w:r>
             <w:r>
               <w:rPr>
@@ -8977,7 +9066,30 @@
                 <w:vertAlign w:val="superscript"/>
                 <w:lang w:val="vi-VN"/>
               </w:rPr>
-              <w:t>-</w:t>
+              <w:t>-2</w:t>
+            </w:r>
+          </w:p>
+        </w:tc>
+        <w:tc>
+          <w:tcPr>
+            <w:tcW w:w="2405" w:type="dxa"/>
+          </w:tcPr>
+          <w:p>
+            <w:pPr>
+              <w:jc w:val="center"/>
+              <w:rPr>
+                <w:sz w:val="26"/>
+                <w:szCs w:val="26"/>
+                <w:lang w:val="vi-VN"/>
+              </w:rPr>
+            </w:pPr>
+            <w:r>
+              <w:rPr>
+                <w:sz w:val="26"/>
+                <w:szCs w:val="26"/>
+                <w:lang w:val="vi-VN"/>
+              </w:rPr>
+              <w:t>5.61x10</w:t>
             </w:r>
             <w:r>
               <w:rPr>
@@ -8986,56 +9098,7 @@
                 <w:vertAlign w:val="superscript"/>
                 <w:lang w:val="vi-VN"/>
               </w:rPr>
-              <w:t>2</w:t>
-            </w:r>
-          </w:p>
-        </w:tc>
-        <w:tc>
-          <w:tcPr>
-            <w:tcW w:w="2405" w:type="dxa"/>
-          </w:tcPr>
-          <w:p>
-            <w:pPr>
-              <w:jc w:val="center"/>
-              <w:rPr>
-                <w:sz w:val="26"/>
-                <w:szCs w:val="26"/>
-                <w:lang w:val="vi-VN"/>
-              </w:rPr>
-            </w:pPr>
-            <w:r>
-              <w:rPr>
-                <w:sz w:val="26"/>
-                <w:szCs w:val="26"/>
-                <w:lang w:val="vi-VN"/>
-              </w:rPr>
-              <w:t>5.61</w:t>
-            </w:r>
-            <w:r>
-              <w:rPr>
-                <w:sz w:val="26"/>
-                <w:szCs w:val="26"/>
-                <w:lang w:val="vi-VN"/>
-              </w:rPr>
-              <w:t>x10</w:t>
-            </w:r>
-            <w:r>
-              <w:rPr>
-                <w:sz w:val="26"/>
-                <w:szCs w:val="26"/>
-                <w:vertAlign w:val="superscript"/>
-                <w:lang w:val="vi-VN"/>
-              </w:rPr>
-              <w:t>-</w:t>
-            </w:r>
-            <w:r>
-              <w:rPr>
-                <w:sz w:val="26"/>
-                <w:szCs w:val="26"/>
-                <w:vertAlign w:val="superscript"/>
-                <w:lang w:val="vi-VN"/>
-              </w:rPr>
-              <w:t>2</w:t>
+              <w:t>-2</w:t>
             </w:r>
           </w:p>
         </w:tc>
@@ -9106,15 +9169,7 @@
                 <w:szCs w:val="26"/>
                 <w:lang w:val="vi-VN"/>
               </w:rPr>
-              <w:t>3.65</w:t>
-            </w:r>
-            <w:r>
-              <w:rPr>
-                <w:sz w:val="26"/>
-                <w:szCs w:val="26"/>
-                <w:lang w:val="vi-VN"/>
-              </w:rPr>
-              <w:t>x10</w:t>
+              <w:t>3.65x10</w:t>
             </w:r>
             <w:r>
               <w:rPr>
@@ -9123,7 +9178,30 @@
                 <w:vertAlign w:val="superscript"/>
                 <w:lang w:val="vi-VN"/>
               </w:rPr>
-              <w:t>-</w:t>
+              <w:t>-2</w:t>
+            </w:r>
+          </w:p>
+        </w:tc>
+        <w:tc>
+          <w:tcPr>
+            <w:tcW w:w="2405" w:type="dxa"/>
+          </w:tcPr>
+          <w:p>
+            <w:pPr>
+              <w:jc w:val="center"/>
+              <w:rPr>
+                <w:sz w:val="26"/>
+                <w:szCs w:val="26"/>
+                <w:lang w:val="vi-VN"/>
+              </w:rPr>
+            </w:pPr>
+            <w:r>
+              <w:rPr>
+                <w:sz w:val="26"/>
+                <w:szCs w:val="26"/>
+                <w:lang w:val="vi-VN"/>
+              </w:rPr>
+              <w:t>3.73x10</w:t>
             </w:r>
             <w:r>
               <w:rPr>
@@ -9132,56 +9210,7 @@
                 <w:vertAlign w:val="superscript"/>
                 <w:lang w:val="vi-VN"/>
               </w:rPr>
-              <w:t>2</w:t>
-            </w:r>
-          </w:p>
-        </w:tc>
-        <w:tc>
-          <w:tcPr>
-            <w:tcW w:w="2405" w:type="dxa"/>
-          </w:tcPr>
-          <w:p>
-            <w:pPr>
-              <w:jc w:val="center"/>
-              <w:rPr>
-                <w:sz w:val="26"/>
-                <w:szCs w:val="26"/>
-                <w:lang w:val="vi-VN"/>
-              </w:rPr>
-            </w:pPr>
-            <w:r>
-              <w:rPr>
-                <w:sz w:val="26"/>
-                <w:szCs w:val="26"/>
-                <w:lang w:val="vi-VN"/>
-              </w:rPr>
-              <w:t>3.73</w:t>
-            </w:r>
-            <w:r>
-              <w:rPr>
-                <w:sz w:val="26"/>
-                <w:szCs w:val="26"/>
-                <w:lang w:val="vi-VN"/>
-              </w:rPr>
-              <w:t>x10</w:t>
-            </w:r>
-            <w:r>
-              <w:rPr>
-                <w:sz w:val="26"/>
-                <w:szCs w:val="26"/>
-                <w:vertAlign w:val="superscript"/>
-                <w:lang w:val="vi-VN"/>
-              </w:rPr>
-              <w:t>-</w:t>
-            </w:r>
-            <w:r>
-              <w:rPr>
-                <w:sz w:val="26"/>
-                <w:szCs w:val="26"/>
-                <w:vertAlign w:val="superscript"/>
-                <w:lang w:val="vi-VN"/>
-              </w:rPr>
-              <w:t>2</w:t>
+              <w:t>-2</w:t>
             </w:r>
           </w:p>
         </w:tc>
@@ -9252,15 +9281,7 @@
                 <w:szCs w:val="26"/>
                 <w:lang w:val="vi-VN"/>
               </w:rPr>
-              <w:t>2.17</w:t>
-            </w:r>
-            <w:r>
-              <w:rPr>
-                <w:sz w:val="26"/>
-                <w:szCs w:val="26"/>
-                <w:lang w:val="vi-VN"/>
-              </w:rPr>
-              <w:t>x10</w:t>
+              <w:t>2.17x10</w:t>
             </w:r>
             <w:r>
               <w:rPr>
@@ -9269,7 +9290,30 @@
                 <w:vertAlign w:val="superscript"/>
                 <w:lang w:val="vi-VN"/>
               </w:rPr>
-              <w:t>-</w:t>
+              <w:t>-2</w:t>
+            </w:r>
+          </w:p>
+        </w:tc>
+        <w:tc>
+          <w:tcPr>
+            <w:tcW w:w="2405" w:type="dxa"/>
+          </w:tcPr>
+          <w:p>
+            <w:pPr>
+              <w:jc w:val="center"/>
+              <w:rPr>
+                <w:sz w:val="26"/>
+                <w:szCs w:val="26"/>
+                <w:lang w:val="vi-VN"/>
+              </w:rPr>
+            </w:pPr>
+            <w:r>
+              <w:rPr>
+                <w:sz w:val="26"/>
+                <w:szCs w:val="26"/>
+                <w:lang w:val="vi-VN"/>
+              </w:rPr>
+              <w:t>2.28x10</w:t>
             </w:r>
             <w:r>
               <w:rPr>
@@ -9278,56 +9322,7 @@
                 <w:vertAlign w:val="superscript"/>
                 <w:lang w:val="vi-VN"/>
               </w:rPr>
-              <w:t>2</w:t>
-            </w:r>
-          </w:p>
-        </w:tc>
-        <w:tc>
-          <w:tcPr>
-            <w:tcW w:w="2405" w:type="dxa"/>
-          </w:tcPr>
-          <w:p>
-            <w:pPr>
-              <w:jc w:val="center"/>
-              <w:rPr>
-                <w:sz w:val="26"/>
-                <w:szCs w:val="26"/>
-                <w:lang w:val="vi-VN"/>
-              </w:rPr>
-            </w:pPr>
-            <w:r>
-              <w:rPr>
-                <w:sz w:val="26"/>
-                <w:szCs w:val="26"/>
-                <w:lang w:val="vi-VN"/>
-              </w:rPr>
-              <w:t>2.28</w:t>
-            </w:r>
-            <w:r>
-              <w:rPr>
-                <w:sz w:val="26"/>
-                <w:szCs w:val="26"/>
-                <w:lang w:val="vi-VN"/>
-              </w:rPr>
-              <w:t>x10</w:t>
-            </w:r>
-            <w:r>
-              <w:rPr>
-                <w:sz w:val="26"/>
-                <w:szCs w:val="26"/>
-                <w:vertAlign w:val="superscript"/>
-                <w:lang w:val="vi-VN"/>
-              </w:rPr>
-              <w:t>-</w:t>
-            </w:r>
-            <w:r>
-              <w:rPr>
-                <w:sz w:val="26"/>
-                <w:szCs w:val="26"/>
-                <w:vertAlign w:val="superscript"/>
-                <w:lang w:val="vi-VN"/>
-              </w:rPr>
-              <w:t>2</w:t>
+              <w:t>-2</w:t>
             </w:r>
           </w:p>
         </w:tc>
@@ -9398,15 +9393,7 @@
                 <w:szCs w:val="26"/>
                 <w:lang w:val="vi-VN"/>
               </w:rPr>
-              <w:t>1.14</w:t>
-            </w:r>
-            <w:r>
-              <w:rPr>
-                <w:sz w:val="26"/>
-                <w:szCs w:val="26"/>
-                <w:lang w:val="vi-VN"/>
-              </w:rPr>
-              <w:t>x10</w:t>
+              <w:t>1.14x10</w:t>
             </w:r>
             <w:r>
               <w:rPr>
@@ -9415,7 +9402,30 @@
                 <w:vertAlign w:val="superscript"/>
                 <w:lang w:val="vi-VN"/>
               </w:rPr>
-              <w:t>-</w:t>
+              <w:t>-2</w:t>
+            </w:r>
+          </w:p>
+        </w:tc>
+        <w:tc>
+          <w:tcPr>
+            <w:tcW w:w="2405" w:type="dxa"/>
+          </w:tcPr>
+          <w:p>
+            <w:pPr>
+              <w:jc w:val="center"/>
+              <w:rPr>
+                <w:sz w:val="26"/>
+                <w:szCs w:val="26"/>
+                <w:lang w:val="vi-VN"/>
+              </w:rPr>
+            </w:pPr>
+            <w:r>
+              <w:rPr>
+                <w:sz w:val="26"/>
+                <w:szCs w:val="26"/>
+                <w:lang w:val="vi-VN"/>
+              </w:rPr>
+              <w:t>1.24x10</w:t>
             </w:r>
             <w:r>
               <w:rPr>
@@ -9424,56 +9434,7 @@
                 <w:vertAlign w:val="superscript"/>
                 <w:lang w:val="vi-VN"/>
               </w:rPr>
-              <w:t>2</w:t>
-            </w:r>
-          </w:p>
-        </w:tc>
-        <w:tc>
-          <w:tcPr>
-            <w:tcW w:w="2405" w:type="dxa"/>
-          </w:tcPr>
-          <w:p>
-            <w:pPr>
-              <w:jc w:val="center"/>
-              <w:rPr>
-                <w:sz w:val="26"/>
-                <w:szCs w:val="26"/>
-                <w:lang w:val="vi-VN"/>
-              </w:rPr>
-            </w:pPr>
-            <w:r>
-              <w:rPr>
-                <w:sz w:val="26"/>
-                <w:szCs w:val="26"/>
-                <w:lang w:val="vi-VN"/>
-              </w:rPr>
-              <w:t>1.24</w:t>
-            </w:r>
-            <w:r>
-              <w:rPr>
-                <w:sz w:val="26"/>
-                <w:szCs w:val="26"/>
-                <w:lang w:val="vi-VN"/>
-              </w:rPr>
-              <w:t>x10</w:t>
-            </w:r>
-            <w:r>
-              <w:rPr>
-                <w:sz w:val="26"/>
-                <w:szCs w:val="26"/>
-                <w:vertAlign w:val="superscript"/>
-                <w:lang w:val="vi-VN"/>
-              </w:rPr>
-              <w:t>-</w:t>
-            </w:r>
-            <w:r>
-              <w:rPr>
-                <w:sz w:val="26"/>
-                <w:szCs w:val="26"/>
-                <w:vertAlign w:val="superscript"/>
-                <w:lang w:val="vi-VN"/>
-              </w:rPr>
-              <w:t>2</w:t>
+              <w:t>-2</w:t>
             </w:r>
           </w:p>
         </w:tc>
@@ -9544,15 +9505,7 @@
                 <w:szCs w:val="26"/>
                 <w:lang w:val="vi-VN"/>
               </w:rPr>
-              <w:t>6.2</w:t>
-            </w:r>
-            <w:r>
-              <w:rPr>
-                <w:sz w:val="26"/>
-                <w:szCs w:val="26"/>
-                <w:lang w:val="vi-VN"/>
-              </w:rPr>
-              <w:t>x10</w:t>
+              <w:t>6.2x10</w:t>
             </w:r>
             <w:r>
               <w:rPr>
@@ -9561,7 +9514,30 @@
                 <w:vertAlign w:val="superscript"/>
                 <w:lang w:val="vi-VN"/>
               </w:rPr>
-              <w:t>-</w:t>
+              <w:t>-3</w:t>
+            </w:r>
+          </w:p>
+        </w:tc>
+        <w:tc>
+          <w:tcPr>
+            <w:tcW w:w="2405" w:type="dxa"/>
+          </w:tcPr>
+          <w:p>
+            <w:pPr>
+              <w:jc w:val="center"/>
+              <w:rPr>
+                <w:sz w:val="26"/>
+                <w:szCs w:val="26"/>
+                <w:lang w:val="vi-VN"/>
+              </w:rPr>
+            </w:pPr>
+            <w:r>
+              <w:rPr>
+                <w:sz w:val="26"/>
+                <w:szCs w:val="26"/>
+                <w:lang w:val="vi-VN"/>
+              </w:rPr>
+              <w:t>5.9x10</w:t>
             </w:r>
             <w:r>
               <w:rPr>
@@ -9570,56 +9546,7 @@
                 <w:vertAlign w:val="superscript"/>
                 <w:lang w:val="vi-VN"/>
               </w:rPr>
-              <w:t>3</w:t>
-            </w:r>
-          </w:p>
-        </w:tc>
-        <w:tc>
-          <w:tcPr>
-            <w:tcW w:w="2405" w:type="dxa"/>
-          </w:tcPr>
-          <w:p>
-            <w:pPr>
-              <w:jc w:val="center"/>
-              <w:rPr>
-                <w:sz w:val="26"/>
-                <w:szCs w:val="26"/>
-                <w:lang w:val="vi-VN"/>
-              </w:rPr>
-            </w:pPr>
-            <w:r>
-              <w:rPr>
-                <w:sz w:val="26"/>
-                <w:szCs w:val="26"/>
-                <w:lang w:val="vi-VN"/>
-              </w:rPr>
-              <w:t>5.9</w:t>
-            </w:r>
-            <w:r>
-              <w:rPr>
-                <w:sz w:val="26"/>
-                <w:szCs w:val="26"/>
-                <w:lang w:val="vi-VN"/>
-              </w:rPr>
-              <w:t>x10</w:t>
-            </w:r>
-            <w:r>
-              <w:rPr>
-                <w:sz w:val="26"/>
-                <w:szCs w:val="26"/>
-                <w:vertAlign w:val="superscript"/>
-                <w:lang w:val="vi-VN"/>
-              </w:rPr>
-              <w:t>-</w:t>
-            </w:r>
-            <w:r>
-              <w:rPr>
-                <w:sz w:val="26"/>
-                <w:szCs w:val="26"/>
-                <w:vertAlign w:val="superscript"/>
-                <w:lang w:val="vi-VN"/>
-              </w:rPr>
-              <w:t>3</w:t>
+              <w:t>-3</w:t>
             </w:r>
           </w:p>
         </w:tc>
@@ -9690,15 +9617,7 @@
                 <w:szCs w:val="26"/>
                 <w:lang w:val="vi-VN"/>
               </w:rPr>
-              <w:t>2.55</w:t>
-            </w:r>
-            <w:r>
-              <w:rPr>
-                <w:sz w:val="26"/>
-                <w:szCs w:val="26"/>
-                <w:lang w:val="vi-VN"/>
-              </w:rPr>
-              <w:t>x10</w:t>
+              <w:t>2.55x10</w:t>
             </w:r>
             <w:r>
               <w:rPr>
@@ -9707,7 +9626,30 @@
                 <w:vertAlign w:val="superscript"/>
                 <w:lang w:val="vi-VN"/>
               </w:rPr>
-              <w:t>-</w:t>
+              <w:t>-3</w:t>
+            </w:r>
+          </w:p>
+        </w:tc>
+        <w:tc>
+          <w:tcPr>
+            <w:tcW w:w="2405" w:type="dxa"/>
+          </w:tcPr>
+          <w:p>
+            <w:pPr>
+              <w:jc w:val="center"/>
+              <w:rPr>
+                <w:sz w:val="26"/>
+                <w:szCs w:val="26"/>
+                <w:lang w:val="vi-VN"/>
+              </w:rPr>
+            </w:pPr>
+            <w:r>
+              <w:rPr>
+                <w:sz w:val="26"/>
+                <w:szCs w:val="26"/>
+                <w:lang w:val="vi-VN"/>
+              </w:rPr>
+              <w:t>2.36x10</w:t>
             </w:r>
             <w:r>
               <w:rPr>
@@ -9716,56 +9658,7 @@
                 <w:vertAlign w:val="superscript"/>
                 <w:lang w:val="vi-VN"/>
               </w:rPr>
-              <w:t>3</w:t>
-            </w:r>
-          </w:p>
-        </w:tc>
-        <w:tc>
-          <w:tcPr>
-            <w:tcW w:w="2405" w:type="dxa"/>
-          </w:tcPr>
-          <w:p>
-            <w:pPr>
-              <w:jc w:val="center"/>
-              <w:rPr>
-                <w:sz w:val="26"/>
-                <w:szCs w:val="26"/>
-                <w:lang w:val="vi-VN"/>
-              </w:rPr>
-            </w:pPr>
-            <w:r>
-              <w:rPr>
-                <w:sz w:val="26"/>
-                <w:szCs w:val="26"/>
-                <w:lang w:val="vi-VN"/>
-              </w:rPr>
-              <w:t>2.36</w:t>
-            </w:r>
-            <w:r>
-              <w:rPr>
-                <w:sz w:val="26"/>
-                <w:szCs w:val="26"/>
-                <w:lang w:val="vi-VN"/>
-              </w:rPr>
-              <w:t>x10</w:t>
-            </w:r>
-            <w:r>
-              <w:rPr>
-                <w:sz w:val="26"/>
-                <w:szCs w:val="26"/>
-                <w:vertAlign w:val="superscript"/>
-                <w:lang w:val="vi-VN"/>
-              </w:rPr>
-              <w:t>-</w:t>
-            </w:r>
-            <w:r>
-              <w:rPr>
-                <w:sz w:val="26"/>
-                <w:szCs w:val="26"/>
-                <w:vertAlign w:val="superscript"/>
-                <w:lang w:val="vi-VN"/>
-              </w:rPr>
-              <w:t>3</w:t>
+              <w:t>-3</w:t>
             </w:r>
           </w:p>
         </w:tc>
@@ -9836,15 +9729,7 @@
                 <w:szCs w:val="26"/>
                 <w:lang w:val="vi-VN"/>
               </w:rPr>
-              <w:t>9.5</w:t>
-            </w:r>
-            <w:r>
-              <w:rPr>
-                <w:sz w:val="26"/>
-                <w:szCs w:val="26"/>
-                <w:lang w:val="vi-VN"/>
-              </w:rPr>
-              <w:t>x10</w:t>
+              <w:t>9.5x10</w:t>
             </w:r>
             <w:r>
               <w:rPr>
@@ -9853,7 +9738,30 @@
                 <w:vertAlign w:val="superscript"/>
                 <w:lang w:val="vi-VN"/>
               </w:rPr>
-              <w:t>-</w:t>
+              <w:t>-4</w:t>
+            </w:r>
+          </w:p>
+        </w:tc>
+        <w:tc>
+          <w:tcPr>
+            <w:tcW w:w="2405" w:type="dxa"/>
+          </w:tcPr>
+          <w:p>
+            <w:pPr>
+              <w:jc w:val="center"/>
+              <w:rPr>
+                <w:sz w:val="26"/>
+                <w:szCs w:val="26"/>
+                <w:lang w:val="vi-VN"/>
+              </w:rPr>
+            </w:pPr>
+            <w:r>
+              <w:rPr>
+                <w:sz w:val="26"/>
+                <w:szCs w:val="26"/>
+                <w:lang w:val="vi-VN"/>
+              </w:rPr>
+              <w:t>7.63x10</w:t>
             </w:r>
             <w:r>
               <w:rPr>
@@ -9862,56 +9770,7 @@
                 <w:vertAlign w:val="superscript"/>
                 <w:lang w:val="vi-VN"/>
               </w:rPr>
-              <w:t>4</w:t>
-            </w:r>
-          </w:p>
-        </w:tc>
-        <w:tc>
-          <w:tcPr>
-            <w:tcW w:w="2405" w:type="dxa"/>
-          </w:tcPr>
-          <w:p>
-            <w:pPr>
-              <w:jc w:val="center"/>
-              <w:rPr>
-                <w:sz w:val="26"/>
-                <w:szCs w:val="26"/>
-                <w:lang w:val="vi-VN"/>
-              </w:rPr>
-            </w:pPr>
-            <w:r>
-              <w:rPr>
-                <w:sz w:val="26"/>
-                <w:szCs w:val="26"/>
-                <w:lang w:val="vi-VN"/>
-              </w:rPr>
-              <w:t>7.63</w:t>
-            </w:r>
-            <w:r>
-              <w:rPr>
-                <w:sz w:val="26"/>
-                <w:szCs w:val="26"/>
-                <w:lang w:val="vi-VN"/>
-              </w:rPr>
-              <w:t>x10</w:t>
-            </w:r>
-            <w:r>
-              <w:rPr>
-                <w:sz w:val="26"/>
-                <w:szCs w:val="26"/>
-                <w:vertAlign w:val="superscript"/>
-                <w:lang w:val="vi-VN"/>
-              </w:rPr>
-              <w:t>-</w:t>
-            </w:r>
-            <w:r>
-              <w:rPr>
-                <w:sz w:val="26"/>
-                <w:szCs w:val="26"/>
-                <w:vertAlign w:val="superscript"/>
-                <w:lang w:val="vi-VN"/>
-              </w:rPr>
-              <w:t>4</w:t>
+              <w:t>-4</w:t>
             </w:r>
           </w:p>
         </w:tc>
@@ -9982,15 +9841,7 @@
                 <w:szCs w:val="26"/>
                 <w:lang w:val="vi-VN"/>
               </w:rPr>
-              <w:t>1</w:t>
-            </w:r>
-            <w:r>
-              <w:rPr>
-                <w:sz w:val="26"/>
-                <w:szCs w:val="26"/>
-                <w:lang w:val="vi-VN"/>
-              </w:rPr>
-              <w:t>x10</w:t>
+              <w:t>1x10</w:t>
             </w:r>
             <w:r>
               <w:rPr>
@@ -9999,7 +9850,30 @@
                 <w:vertAlign w:val="superscript"/>
                 <w:lang w:val="vi-VN"/>
               </w:rPr>
-              <w:t>-</w:t>
+              <w:t>-4</w:t>
+            </w:r>
+          </w:p>
+        </w:tc>
+        <w:tc>
+          <w:tcPr>
+            <w:tcW w:w="2405" w:type="dxa"/>
+          </w:tcPr>
+          <w:p>
+            <w:pPr>
+              <w:jc w:val="center"/>
+              <w:rPr>
+                <w:sz w:val="26"/>
+                <w:szCs w:val="26"/>
+                <w:lang w:val="vi-VN"/>
+              </w:rPr>
+            </w:pPr>
+            <w:r>
+              <w:rPr>
+                <w:sz w:val="26"/>
+                <w:szCs w:val="26"/>
+                <w:lang w:val="vi-VN"/>
+              </w:rPr>
+              <w:t>1.88x10</w:t>
             </w:r>
             <w:r>
               <w:rPr>
@@ -10008,56 +9882,7 @@
                 <w:vertAlign w:val="superscript"/>
                 <w:lang w:val="vi-VN"/>
               </w:rPr>
-              <w:t>4</w:t>
-            </w:r>
-          </w:p>
-        </w:tc>
-        <w:tc>
-          <w:tcPr>
-            <w:tcW w:w="2405" w:type="dxa"/>
-          </w:tcPr>
-          <w:p>
-            <w:pPr>
-              <w:jc w:val="center"/>
-              <w:rPr>
-                <w:sz w:val="26"/>
-                <w:szCs w:val="26"/>
-                <w:lang w:val="vi-VN"/>
-              </w:rPr>
-            </w:pPr>
-            <w:r>
-              <w:rPr>
-                <w:sz w:val="26"/>
-                <w:szCs w:val="26"/>
-                <w:lang w:val="vi-VN"/>
-              </w:rPr>
-              <w:t>1.88</w:t>
-            </w:r>
-            <w:r>
-              <w:rPr>
-                <w:sz w:val="26"/>
-                <w:szCs w:val="26"/>
-                <w:lang w:val="vi-VN"/>
-              </w:rPr>
-              <w:t>x10</w:t>
-            </w:r>
-            <w:r>
-              <w:rPr>
-                <w:sz w:val="26"/>
-                <w:szCs w:val="26"/>
-                <w:vertAlign w:val="superscript"/>
-                <w:lang w:val="vi-VN"/>
-              </w:rPr>
-              <w:t>-</w:t>
-            </w:r>
-            <w:r>
-              <w:rPr>
-                <w:sz w:val="26"/>
-                <w:szCs w:val="26"/>
-                <w:vertAlign w:val="superscript"/>
-                <w:lang w:val="vi-VN"/>
-              </w:rPr>
-              <w:t>4</w:t>
+              <w:t>-4</w:t>
             </w:r>
           </w:p>
         </w:tc>
@@ -10151,15 +9976,7 @@
                 <w:szCs w:val="26"/>
                 <w:lang w:val="vi-VN"/>
               </w:rPr>
-              <w:t>3.30</w:t>
-            </w:r>
-            <w:r>
-              <w:rPr>
-                <w:sz w:val="26"/>
-                <w:szCs w:val="26"/>
-                <w:lang w:val="vi-VN"/>
-              </w:rPr>
-              <w:t>x10</w:t>
+              <w:t>3.30x10</w:t>
             </w:r>
             <w:r>
               <w:rPr>
@@ -10168,16 +9985,7 @@
                 <w:vertAlign w:val="superscript"/>
                 <w:lang w:val="vi-VN"/>
               </w:rPr>
-              <w:t>-</w:t>
-            </w:r>
-            <w:r>
-              <w:rPr>
-                <w:sz w:val="26"/>
-                <w:szCs w:val="26"/>
-                <w:vertAlign w:val="superscript"/>
-                <w:lang w:val="vi-VN"/>
-              </w:rPr>
-              <w:t>5</w:t>
+              <w:t>-5</w:t>
             </w:r>
           </w:p>
         </w:tc>
@@ -10271,15 +10079,7 @@
                 <w:szCs w:val="26"/>
                 <w:lang w:val="vi-VN"/>
               </w:rPr>
-              <w:t>3.78</w:t>
-            </w:r>
-            <w:r>
-              <w:rPr>
-                <w:sz w:val="26"/>
-                <w:szCs w:val="26"/>
-                <w:lang w:val="vi-VN"/>
-              </w:rPr>
-              <w:t>x10</w:t>
+              <w:t>3.78x10</w:t>
             </w:r>
             <w:r>
               <w:rPr>
@@ -10288,16 +10088,7 @@
                 <w:vertAlign w:val="superscript"/>
                 <w:lang w:val="vi-VN"/>
               </w:rPr>
-              <w:t>-</w:t>
-            </w:r>
-            <w:r>
-              <w:rPr>
-                <w:sz w:val="26"/>
-                <w:szCs w:val="26"/>
-                <w:vertAlign w:val="superscript"/>
-                <w:lang w:val="vi-VN"/>
-              </w:rPr>
-              <w:t>6</w:t>
+              <w:t>-6</w:t>
             </w:r>
           </w:p>
         </w:tc>
@@ -10391,15 +10182,7 @@
                 <w:szCs w:val="26"/>
                 <w:lang w:val="vi-VN"/>
               </w:rPr>
-              <w:t>2.53</w:t>
-            </w:r>
-            <w:r>
-              <w:rPr>
-                <w:sz w:val="26"/>
-                <w:szCs w:val="26"/>
-                <w:lang w:val="vi-VN"/>
-              </w:rPr>
-              <w:t>x10</w:t>
+              <w:t>2.53x10</w:t>
             </w:r>
             <w:r>
               <w:rPr>
@@ -10408,16 +10191,7 @@
                 <w:vertAlign w:val="superscript"/>
                 <w:lang w:val="vi-VN"/>
               </w:rPr>
-              <w:t>-</w:t>
-            </w:r>
-            <w:r>
-              <w:rPr>
-                <w:sz w:val="26"/>
-                <w:szCs w:val="26"/>
-                <w:vertAlign w:val="superscript"/>
-                <w:lang w:val="vi-VN"/>
-              </w:rPr>
-              <w:t>7</w:t>
+              <w:t>-7</w:t>
             </w:r>
           </w:p>
         </w:tc>
@@ -13804,9 +13578,9 @@
     </w:lvl>
   </w:abstractNum>
   <w:abstractNum w:abstractNumId="2" w15:restartNumberingAfterBreak="0">
-    <w:nsid w:val="0F9875E7"/>
+    <w:nsid w:val="0DEA7FA9"/>
     <w:multiLevelType w:val="multilevel"/>
-    <w:tmpl w:val="CB0C1CA0"/>
+    <w:tmpl w:val="B4523574"/>
     <w:lvl w:ilvl="0">
       <w:start w:val="1"/>
       <w:numFmt w:val="bullet"/>
@@ -13953,212 +13727,9 @@
     </w:lvl>
   </w:abstractNum>
   <w:abstractNum w:abstractNumId="3" w15:restartNumberingAfterBreak="0">
-    <w:nsid w:val="1623013A"/>
-    <w:multiLevelType w:val="hybridMultilevel"/>
-    <w:tmpl w:val="FF4A42BA"/>
-    <w:lvl w:ilvl="0" w:tplc="FC34EC76">
-      <w:start w:val="17"/>
-      <w:numFmt w:val="bullet"/>
-      <w:lvlText w:val=""/>
-      <w:lvlJc w:val="left"/>
-      <w:pPr>
-        <w:ind w:left="720" w:hanging="360"/>
-      </w:pPr>
-      <w:rPr>
-        <w:rFonts w:ascii="Wingdings" w:eastAsia="Times New Roman" w:hAnsi="Wingdings" w:cs="Times New Roman" w:hint="default"/>
-      </w:rPr>
-    </w:lvl>
-    <w:lvl w:ilvl="1" w:tplc="04090003" w:tentative="1">
-      <w:start w:val="1"/>
-      <w:numFmt w:val="bullet"/>
-      <w:lvlText w:val="o"/>
-      <w:lvlJc w:val="left"/>
-      <w:pPr>
-        <w:ind w:left="1440" w:hanging="360"/>
-      </w:pPr>
-      <w:rPr>
-        <w:rFonts w:ascii="Courier New" w:hAnsi="Courier New" w:cs="Courier New" w:hint="default"/>
-      </w:rPr>
-    </w:lvl>
-    <w:lvl w:ilvl="2" w:tplc="04090005" w:tentative="1">
-      <w:start w:val="1"/>
-      <w:numFmt w:val="bullet"/>
-      <w:lvlText w:val=""/>
-      <w:lvlJc w:val="left"/>
-      <w:pPr>
-        <w:ind w:left="2160" w:hanging="360"/>
-      </w:pPr>
-      <w:rPr>
-        <w:rFonts w:ascii="Wingdings" w:hAnsi="Wingdings" w:hint="default"/>
-      </w:rPr>
-    </w:lvl>
-    <w:lvl w:ilvl="3" w:tplc="04090001" w:tentative="1">
-      <w:start w:val="1"/>
-      <w:numFmt w:val="bullet"/>
-      <w:lvlText w:val=""/>
-      <w:lvlJc w:val="left"/>
-      <w:pPr>
-        <w:ind w:left="2880" w:hanging="360"/>
-      </w:pPr>
-      <w:rPr>
-        <w:rFonts w:ascii="Symbol" w:hAnsi="Symbol" w:hint="default"/>
-      </w:rPr>
-    </w:lvl>
-    <w:lvl w:ilvl="4" w:tplc="04090003" w:tentative="1">
-      <w:start w:val="1"/>
-      <w:numFmt w:val="bullet"/>
-      <w:lvlText w:val="o"/>
-      <w:lvlJc w:val="left"/>
-      <w:pPr>
-        <w:ind w:left="3600" w:hanging="360"/>
-      </w:pPr>
-      <w:rPr>
-        <w:rFonts w:ascii="Courier New" w:hAnsi="Courier New" w:cs="Courier New" w:hint="default"/>
-      </w:rPr>
-    </w:lvl>
-    <w:lvl w:ilvl="5" w:tplc="04090005" w:tentative="1">
-      <w:start w:val="1"/>
-      <w:numFmt w:val="bullet"/>
-      <w:lvlText w:val=""/>
-      <w:lvlJc w:val="left"/>
-      <w:pPr>
-        <w:ind w:left="4320" w:hanging="360"/>
-      </w:pPr>
-      <w:rPr>
-        <w:rFonts w:ascii="Wingdings" w:hAnsi="Wingdings" w:hint="default"/>
-      </w:rPr>
-    </w:lvl>
-    <w:lvl w:ilvl="6" w:tplc="04090001" w:tentative="1">
-      <w:start w:val="1"/>
-      <w:numFmt w:val="bullet"/>
-      <w:lvlText w:val=""/>
-      <w:lvlJc w:val="left"/>
-      <w:pPr>
-        <w:ind w:left="5040" w:hanging="360"/>
-      </w:pPr>
-      <w:rPr>
-        <w:rFonts w:ascii="Symbol" w:hAnsi="Symbol" w:hint="default"/>
-      </w:rPr>
-    </w:lvl>
-    <w:lvl w:ilvl="7" w:tplc="04090003" w:tentative="1">
-      <w:start w:val="1"/>
-      <w:numFmt w:val="bullet"/>
-      <w:lvlText w:val="o"/>
-      <w:lvlJc w:val="left"/>
-      <w:pPr>
-        <w:ind w:left="5760" w:hanging="360"/>
-      </w:pPr>
-      <w:rPr>
-        <w:rFonts w:ascii="Courier New" w:hAnsi="Courier New" w:cs="Courier New" w:hint="default"/>
-      </w:rPr>
-    </w:lvl>
-    <w:lvl w:ilvl="8" w:tplc="04090005" w:tentative="1">
-      <w:start w:val="1"/>
-      <w:numFmt w:val="bullet"/>
-      <w:lvlText w:val=""/>
-      <w:lvlJc w:val="left"/>
-      <w:pPr>
-        <w:ind w:left="6480" w:hanging="360"/>
-      </w:pPr>
-      <w:rPr>
-        <w:rFonts w:ascii="Wingdings" w:hAnsi="Wingdings" w:hint="default"/>
-      </w:rPr>
-    </w:lvl>
-  </w:abstractNum>
-  <w:abstractNum w:abstractNumId="4" w15:restartNumberingAfterBreak="0">
-    <w:nsid w:val="1B455BDA"/>
-    <w:multiLevelType w:val="hybridMultilevel"/>
-    <w:tmpl w:val="98DCBB8E"/>
-    <w:lvl w:ilvl="0" w:tplc="BFAE0FFA">
-      <w:start w:val="1"/>
-      <w:numFmt w:val="upperRoman"/>
-      <w:pStyle w:val="Muc-I"/>
-      <w:lvlText w:val="%1."/>
-      <w:lvlJc w:val="left"/>
-      <w:pPr>
-        <w:ind w:left="1080" w:hanging="720"/>
-      </w:pPr>
-      <w:rPr>
-        <w:rFonts w:hint="default"/>
-      </w:rPr>
-    </w:lvl>
-    <w:lvl w:ilvl="1" w:tplc="04090019" w:tentative="1">
-      <w:start w:val="1"/>
-      <w:numFmt w:val="lowerLetter"/>
-      <w:lvlText w:val="%2."/>
-      <w:lvlJc w:val="left"/>
-      <w:pPr>
-        <w:ind w:left="1440" w:hanging="360"/>
-      </w:pPr>
-    </w:lvl>
-    <w:lvl w:ilvl="2" w:tplc="0409001B" w:tentative="1">
-      <w:start w:val="1"/>
-      <w:numFmt w:val="lowerRoman"/>
-      <w:lvlText w:val="%3."/>
-      <w:lvlJc w:val="right"/>
-      <w:pPr>
-        <w:ind w:left="2160" w:hanging="180"/>
-      </w:pPr>
-    </w:lvl>
-    <w:lvl w:ilvl="3" w:tplc="0409000F" w:tentative="1">
-      <w:start w:val="1"/>
-      <w:numFmt w:val="decimal"/>
-      <w:lvlText w:val="%4."/>
-      <w:lvlJc w:val="left"/>
-      <w:pPr>
-        <w:ind w:left="2880" w:hanging="360"/>
-      </w:pPr>
-    </w:lvl>
-    <w:lvl w:ilvl="4" w:tplc="04090019" w:tentative="1">
-      <w:start w:val="1"/>
-      <w:numFmt w:val="lowerLetter"/>
-      <w:lvlText w:val="%5."/>
-      <w:lvlJc w:val="left"/>
-      <w:pPr>
-        <w:ind w:left="3600" w:hanging="360"/>
-      </w:pPr>
-    </w:lvl>
-    <w:lvl w:ilvl="5" w:tplc="0409001B" w:tentative="1">
-      <w:start w:val="1"/>
-      <w:numFmt w:val="lowerRoman"/>
-      <w:lvlText w:val="%6."/>
-      <w:lvlJc w:val="right"/>
-      <w:pPr>
-        <w:ind w:left="4320" w:hanging="180"/>
-      </w:pPr>
-    </w:lvl>
-    <w:lvl w:ilvl="6" w:tplc="0409000F" w:tentative="1">
-      <w:start w:val="1"/>
-      <w:numFmt w:val="decimal"/>
-      <w:lvlText w:val="%7."/>
-      <w:lvlJc w:val="left"/>
-      <w:pPr>
-        <w:ind w:left="5040" w:hanging="360"/>
-      </w:pPr>
-    </w:lvl>
-    <w:lvl w:ilvl="7" w:tplc="04090019" w:tentative="1">
-      <w:start w:val="1"/>
-      <w:numFmt w:val="lowerLetter"/>
-      <w:lvlText w:val="%8."/>
-      <w:lvlJc w:val="left"/>
-      <w:pPr>
-        <w:ind w:left="5760" w:hanging="360"/>
-      </w:pPr>
-    </w:lvl>
-    <w:lvl w:ilvl="8" w:tplc="0409001B" w:tentative="1">
-      <w:start w:val="1"/>
-      <w:numFmt w:val="lowerRoman"/>
-      <w:lvlText w:val="%9."/>
-      <w:lvlJc w:val="right"/>
-      <w:pPr>
-        <w:ind w:left="6480" w:hanging="180"/>
-      </w:pPr>
-    </w:lvl>
-  </w:abstractNum>
-  <w:abstractNum w:abstractNumId="5" w15:restartNumberingAfterBreak="0">
-    <w:nsid w:val="2B767D6F"/>
+    <w:nsid w:val="0F9875E7"/>
     <w:multiLevelType w:val="multilevel"/>
-    <w:tmpl w:val="CF5EC226"/>
+    <w:tmpl w:val="CB0C1CA0"/>
     <w:lvl w:ilvl="0">
       <w:start w:val="1"/>
       <w:numFmt w:val="bullet"/>
@@ -14304,7 +13875,359 @@
       </w:rPr>
     </w:lvl>
   </w:abstractNum>
+  <w:abstractNum w:abstractNumId="4" w15:restartNumberingAfterBreak="0">
+    <w:nsid w:val="1623013A"/>
+    <w:multiLevelType w:val="hybridMultilevel"/>
+    <w:tmpl w:val="FF4A42BA"/>
+    <w:lvl w:ilvl="0" w:tplc="FC34EC76">
+      <w:start w:val="17"/>
+      <w:numFmt w:val="bullet"/>
+      <w:lvlText w:val=""/>
+      <w:lvlJc w:val="left"/>
+      <w:pPr>
+        <w:ind w:left="720" w:hanging="360"/>
+      </w:pPr>
+      <w:rPr>
+        <w:rFonts w:ascii="Wingdings" w:eastAsia="Times New Roman" w:hAnsi="Wingdings" w:cs="Times New Roman" w:hint="default"/>
+      </w:rPr>
+    </w:lvl>
+    <w:lvl w:ilvl="1" w:tplc="04090003" w:tentative="1">
+      <w:start w:val="1"/>
+      <w:numFmt w:val="bullet"/>
+      <w:lvlText w:val="o"/>
+      <w:lvlJc w:val="left"/>
+      <w:pPr>
+        <w:ind w:left="1440" w:hanging="360"/>
+      </w:pPr>
+      <w:rPr>
+        <w:rFonts w:ascii="Courier New" w:hAnsi="Courier New" w:cs="Courier New" w:hint="default"/>
+      </w:rPr>
+    </w:lvl>
+    <w:lvl w:ilvl="2" w:tplc="04090005" w:tentative="1">
+      <w:start w:val="1"/>
+      <w:numFmt w:val="bullet"/>
+      <w:lvlText w:val=""/>
+      <w:lvlJc w:val="left"/>
+      <w:pPr>
+        <w:ind w:left="2160" w:hanging="360"/>
+      </w:pPr>
+      <w:rPr>
+        <w:rFonts w:ascii="Wingdings" w:hAnsi="Wingdings" w:hint="default"/>
+      </w:rPr>
+    </w:lvl>
+    <w:lvl w:ilvl="3" w:tplc="04090001" w:tentative="1">
+      <w:start w:val="1"/>
+      <w:numFmt w:val="bullet"/>
+      <w:lvlText w:val=""/>
+      <w:lvlJc w:val="left"/>
+      <w:pPr>
+        <w:ind w:left="2880" w:hanging="360"/>
+      </w:pPr>
+      <w:rPr>
+        <w:rFonts w:ascii="Symbol" w:hAnsi="Symbol" w:hint="default"/>
+      </w:rPr>
+    </w:lvl>
+    <w:lvl w:ilvl="4" w:tplc="04090003" w:tentative="1">
+      <w:start w:val="1"/>
+      <w:numFmt w:val="bullet"/>
+      <w:lvlText w:val="o"/>
+      <w:lvlJc w:val="left"/>
+      <w:pPr>
+        <w:ind w:left="3600" w:hanging="360"/>
+      </w:pPr>
+      <w:rPr>
+        <w:rFonts w:ascii="Courier New" w:hAnsi="Courier New" w:cs="Courier New" w:hint="default"/>
+      </w:rPr>
+    </w:lvl>
+    <w:lvl w:ilvl="5" w:tplc="04090005" w:tentative="1">
+      <w:start w:val="1"/>
+      <w:numFmt w:val="bullet"/>
+      <w:lvlText w:val=""/>
+      <w:lvlJc w:val="left"/>
+      <w:pPr>
+        <w:ind w:left="4320" w:hanging="360"/>
+      </w:pPr>
+      <w:rPr>
+        <w:rFonts w:ascii="Wingdings" w:hAnsi="Wingdings" w:hint="default"/>
+      </w:rPr>
+    </w:lvl>
+    <w:lvl w:ilvl="6" w:tplc="04090001" w:tentative="1">
+      <w:start w:val="1"/>
+      <w:numFmt w:val="bullet"/>
+      <w:lvlText w:val=""/>
+      <w:lvlJc w:val="left"/>
+      <w:pPr>
+        <w:ind w:left="5040" w:hanging="360"/>
+      </w:pPr>
+      <w:rPr>
+        <w:rFonts w:ascii="Symbol" w:hAnsi="Symbol" w:hint="default"/>
+      </w:rPr>
+    </w:lvl>
+    <w:lvl w:ilvl="7" w:tplc="04090003" w:tentative="1">
+      <w:start w:val="1"/>
+      <w:numFmt w:val="bullet"/>
+      <w:lvlText w:val="o"/>
+      <w:lvlJc w:val="left"/>
+      <w:pPr>
+        <w:ind w:left="5760" w:hanging="360"/>
+      </w:pPr>
+      <w:rPr>
+        <w:rFonts w:ascii="Courier New" w:hAnsi="Courier New" w:cs="Courier New" w:hint="default"/>
+      </w:rPr>
+    </w:lvl>
+    <w:lvl w:ilvl="8" w:tplc="04090005" w:tentative="1">
+      <w:start w:val="1"/>
+      <w:numFmt w:val="bullet"/>
+      <w:lvlText w:val=""/>
+      <w:lvlJc w:val="left"/>
+      <w:pPr>
+        <w:ind w:left="6480" w:hanging="360"/>
+      </w:pPr>
+      <w:rPr>
+        <w:rFonts w:ascii="Wingdings" w:hAnsi="Wingdings" w:hint="default"/>
+      </w:rPr>
+    </w:lvl>
+  </w:abstractNum>
+  <w:abstractNum w:abstractNumId="5" w15:restartNumberingAfterBreak="0">
+    <w:nsid w:val="1B455BDA"/>
+    <w:multiLevelType w:val="hybridMultilevel"/>
+    <w:tmpl w:val="98DCBB8E"/>
+    <w:lvl w:ilvl="0" w:tplc="BFAE0FFA">
+      <w:start w:val="1"/>
+      <w:numFmt w:val="upperRoman"/>
+      <w:pStyle w:val="Muc-I"/>
+      <w:lvlText w:val="%1."/>
+      <w:lvlJc w:val="left"/>
+      <w:pPr>
+        <w:ind w:left="1080" w:hanging="720"/>
+      </w:pPr>
+      <w:rPr>
+        <w:rFonts w:hint="default"/>
+      </w:rPr>
+    </w:lvl>
+    <w:lvl w:ilvl="1" w:tplc="04090019" w:tentative="1">
+      <w:start w:val="1"/>
+      <w:numFmt w:val="lowerLetter"/>
+      <w:lvlText w:val="%2."/>
+      <w:lvlJc w:val="left"/>
+      <w:pPr>
+        <w:ind w:left="1440" w:hanging="360"/>
+      </w:pPr>
+    </w:lvl>
+    <w:lvl w:ilvl="2" w:tplc="0409001B" w:tentative="1">
+      <w:start w:val="1"/>
+      <w:numFmt w:val="lowerRoman"/>
+      <w:lvlText w:val="%3."/>
+      <w:lvlJc w:val="right"/>
+      <w:pPr>
+        <w:ind w:left="2160" w:hanging="180"/>
+      </w:pPr>
+    </w:lvl>
+    <w:lvl w:ilvl="3" w:tplc="0409000F" w:tentative="1">
+      <w:start w:val="1"/>
+      <w:numFmt w:val="decimal"/>
+      <w:lvlText w:val="%4."/>
+      <w:lvlJc w:val="left"/>
+      <w:pPr>
+        <w:ind w:left="2880" w:hanging="360"/>
+      </w:pPr>
+    </w:lvl>
+    <w:lvl w:ilvl="4" w:tplc="04090019" w:tentative="1">
+      <w:start w:val="1"/>
+      <w:numFmt w:val="lowerLetter"/>
+      <w:lvlText w:val="%5."/>
+      <w:lvlJc w:val="left"/>
+      <w:pPr>
+        <w:ind w:left="3600" w:hanging="360"/>
+      </w:pPr>
+    </w:lvl>
+    <w:lvl w:ilvl="5" w:tplc="0409001B" w:tentative="1">
+      <w:start w:val="1"/>
+      <w:numFmt w:val="lowerRoman"/>
+      <w:lvlText w:val="%6."/>
+      <w:lvlJc w:val="right"/>
+      <w:pPr>
+        <w:ind w:left="4320" w:hanging="180"/>
+      </w:pPr>
+    </w:lvl>
+    <w:lvl w:ilvl="6" w:tplc="0409000F" w:tentative="1">
+      <w:start w:val="1"/>
+      <w:numFmt w:val="decimal"/>
+      <w:lvlText w:val="%7."/>
+      <w:lvlJc w:val="left"/>
+      <w:pPr>
+        <w:ind w:left="5040" w:hanging="360"/>
+      </w:pPr>
+    </w:lvl>
+    <w:lvl w:ilvl="7" w:tplc="04090019" w:tentative="1">
+      <w:start w:val="1"/>
+      <w:numFmt w:val="lowerLetter"/>
+      <w:lvlText w:val="%8."/>
+      <w:lvlJc w:val="left"/>
+      <w:pPr>
+        <w:ind w:left="5760" w:hanging="360"/>
+      </w:pPr>
+    </w:lvl>
+    <w:lvl w:ilvl="8" w:tplc="0409001B" w:tentative="1">
+      <w:start w:val="1"/>
+      <w:numFmt w:val="lowerRoman"/>
+      <w:lvlText w:val="%9."/>
+      <w:lvlJc w:val="right"/>
+      <w:pPr>
+        <w:ind w:left="6480" w:hanging="180"/>
+      </w:pPr>
+    </w:lvl>
+  </w:abstractNum>
   <w:abstractNum w:abstractNumId="6" w15:restartNumberingAfterBreak="0">
+    <w:nsid w:val="2B767D6F"/>
+    <w:multiLevelType w:val="multilevel"/>
+    <w:tmpl w:val="CF5EC226"/>
+    <w:lvl w:ilvl="0">
+      <w:start w:val="1"/>
+      <w:numFmt w:val="bullet"/>
+      <w:lvlText w:val=""/>
+      <w:lvlJc w:val="left"/>
+      <w:pPr>
+        <w:tabs>
+          <w:tab w:val="num" w:pos="720"/>
+        </w:tabs>
+        <w:ind w:left="720" w:hanging="360"/>
+      </w:pPr>
+      <w:rPr>
+        <w:rFonts w:ascii="Symbol" w:hAnsi="Symbol" w:hint="default"/>
+        <w:sz w:val="20"/>
+      </w:rPr>
+    </w:lvl>
+    <w:lvl w:ilvl="1" w:tentative="1">
+      <w:start w:val="1"/>
+      <w:numFmt w:val="bullet"/>
+      <w:lvlText w:val="o"/>
+      <w:lvlJc w:val="left"/>
+      <w:pPr>
+        <w:tabs>
+          <w:tab w:val="num" w:pos="1440"/>
+        </w:tabs>
+        <w:ind w:left="1440" w:hanging="360"/>
+      </w:pPr>
+      <w:rPr>
+        <w:rFonts w:ascii="Courier New" w:hAnsi="Courier New" w:hint="default"/>
+        <w:sz w:val="20"/>
+      </w:rPr>
+    </w:lvl>
+    <w:lvl w:ilvl="2" w:tentative="1">
+      <w:start w:val="1"/>
+      <w:numFmt w:val="bullet"/>
+      <w:lvlText w:val=""/>
+      <w:lvlJc w:val="left"/>
+      <w:pPr>
+        <w:tabs>
+          <w:tab w:val="num" w:pos="2160"/>
+        </w:tabs>
+        <w:ind w:left="2160" w:hanging="360"/>
+      </w:pPr>
+      <w:rPr>
+        <w:rFonts w:ascii="Wingdings" w:hAnsi="Wingdings" w:hint="default"/>
+        <w:sz w:val="20"/>
+      </w:rPr>
+    </w:lvl>
+    <w:lvl w:ilvl="3" w:tentative="1">
+      <w:start w:val="1"/>
+      <w:numFmt w:val="bullet"/>
+      <w:lvlText w:val=""/>
+      <w:lvlJc w:val="left"/>
+      <w:pPr>
+        <w:tabs>
+          <w:tab w:val="num" w:pos="2880"/>
+        </w:tabs>
+        <w:ind w:left="2880" w:hanging="360"/>
+      </w:pPr>
+      <w:rPr>
+        <w:rFonts w:ascii="Wingdings" w:hAnsi="Wingdings" w:hint="default"/>
+        <w:sz w:val="20"/>
+      </w:rPr>
+    </w:lvl>
+    <w:lvl w:ilvl="4" w:tentative="1">
+      <w:start w:val="1"/>
+      <w:numFmt w:val="bullet"/>
+      <w:lvlText w:val=""/>
+      <w:lvlJc w:val="left"/>
+      <w:pPr>
+        <w:tabs>
+          <w:tab w:val="num" w:pos="3600"/>
+        </w:tabs>
+        <w:ind w:left="3600" w:hanging="360"/>
+      </w:pPr>
+      <w:rPr>
+        <w:rFonts w:ascii="Wingdings" w:hAnsi="Wingdings" w:hint="default"/>
+        <w:sz w:val="20"/>
+      </w:rPr>
+    </w:lvl>
+    <w:lvl w:ilvl="5" w:tentative="1">
+      <w:start w:val="1"/>
+      <w:numFmt w:val="bullet"/>
+      <w:lvlText w:val=""/>
+      <w:lvlJc w:val="left"/>
+      <w:pPr>
+        <w:tabs>
+          <w:tab w:val="num" w:pos="4320"/>
+        </w:tabs>
+        <w:ind w:left="4320" w:hanging="360"/>
+      </w:pPr>
+      <w:rPr>
+        <w:rFonts w:ascii="Wingdings" w:hAnsi="Wingdings" w:hint="default"/>
+        <w:sz w:val="20"/>
+      </w:rPr>
+    </w:lvl>
+    <w:lvl w:ilvl="6" w:tentative="1">
+      <w:start w:val="1"/>
+      <w:numFmt w:val="bullet"/>
+      <w:lvlText w:val=""/>
+      <w:lvlJc w:val="left"/>
+      <w:pPr>
+        <w:tabs>
+          <w:tab w:val="num" w:pos="5040"/>
+        </w:tabs>
+        <w:ind w:left="5040" w:hanging="360"/>
+      </w:pPr>
+      <w:rPr>
+        <w:rFonts w:ascii="Wingdings" w:hAnsi="Wingdings" w:hint="default"/>
+        <w:sz w:val="20"/>
+      </w:rPr>
+    </w:lvl>
+    <w:lvl w:ilvl="7" w:tentative="1">
+      <w:start w:val="1"/>
+      <w:numFmt w:val="bullet"/>
+      <w:lvlText w:val=""/>
+      <w:lvlJc w:val="left"/>
+      <w:pPr>
+        <w:tabs>
+          <w:tab w:val="num" w:pos="5760"/>
+        </w:tabs>
+        <w:ind w:left="5760" w:hanging="360"/>
+      </w:pPr>
+      <w:rPr>
+        <w:rFonts w:ascii="Wingdings" w:hAnsi="Wingdings" w:hint="default"/>
+        <w:sz w:val="20"/>
+      </w:rPr>
+    </w:lvl>
+    <w:lvl w:ilvl="8" w:tentative="1">
+      <w:start w:val="1"/>
+      <w:numFmt w:val="bullet"/>
+      <w:lvlText w:val=""/>
+      <w:lvlJc w:val="left"/>
+      <w:pPr>
+        <w:tabs>
+          <w:tab w:val="num" w:pos="6480"/>
+        </w:tabs>
+        <w:ind w:left="6480" w:hanging="360"/>
+      </w:pPr>
+      <w:rPr>
+        <w:rFonts w:ascii="Wingdings" w:hAnsi="Wingdings" w:hint="default"/>
+        <w:sz w:val="20"/>
+      </w:rPr>
+    </w:lvl>
+  </w:abstractNum>
+  <w:abstractNum w:abstractNumId="7" w15:restartNumberingAfterBreak="0">
     <w:nsid w:val="32231EE7"/>
     <w:multiLevelType w:val="hybridMultilevel"/>
     <w:tmpl w:val="8DBE1E1C"/>
@@ -14419,7 +14342,7 @@
       </w:rPr>
     </w:lvl>
   </w:abstractNum>
-  <w:abstractNum w:abstractNumId="7" w15:restartNumberingAfterBreak="0">
+  <w:abstractNum w:abstractNumId="8" w15:restartNumberingAfterBreak="0">
     <w:nsid w:val="36A40196"/>
     <w:multiLevelType w:val="hybridMultilevel"/>
     <w:tmpl w:val="BEC87E8A"/>
@@ -14534,7 +14457,7 @@
       </w:rPr>
     </w:lvl>
   </w:abstractNum>
-  <w:abstractNum w:abstractNumId="8" w15:restartNumberingAfterBreak="0">
+  <w:abstractNum w:abstractNumId="9" w15:restartNumberingAfterBreak="0">
     <w:nsid w:val="468B15C9"/>
     <w:multiLevelType w:val="hybridMultilevel"/>
     <w:tmpl w:val="8EC463EC"/>
@@ -14624,7 +14547,7 @@
       </w:pPr>
     </w:lvl>
   </w:abstractNum>
-  <w:abstractNum w:abstractNumId="9" w15:restartNumberingAfterBreak="0">
+  <w:abstractNum w:abstractNumId="10" w15:restartNumberingAfterBreak="0">
     <w:nsid w:val="4B791F19"/>
     <w:multiLevelType w:val="hybridMultilevel"/>
     <w:tmpl w:val="29E0C9B0"/>
@@ -14714,7 +14637,7 @@
       </w:pPr>
     </w:lvl>
   </w:abstractNum>
-  <w:abstractNum w:abstractNumId="10" w15:restartNumberingAfterBreak="0">
+  <w:abstractNum w:abstractNumId="11" w15:restartNumberingAfterBreak="0">
     <w:nsid w:val="4E79476E"/>
     <w:multiLevelType w:val="multilevel"/>
     <w:tmpl w:val="4A04E1CA"/>
@@ -14828,7 +14751,7 @@
       </w:rPr>
     </w:lvl>
   </w:abstractNum>
-  <w:abstractNum w:abstractNumId="11" w15:restartNumberingAfterBreak="0">
+  <w:abstractNum w:abstractNumId="12" w15:restartNumberingAfterBreak="0">
     <w:nsid w:val="5DB94F3F"/>
     <w:multiLevelType w:val="multilevel"/>
     <w:tmpl w:val="D4262DE2"/>
@@ -14977,7 +14900,7 @@
       </w:rPr>
     </w:lvl>
   </w:abstractNum>
-  <w:abstractNum w:abstractNumId="12" w15:restartNumberingAfterBreak="0">
+  <w:abstractNum w:abstractNumId="13" w15:restartNumberingAfterBreak="0">
     <w:nsid w:val="71BE4C55"/>
     <w:multiLevelType w:val="hybridMultilevel"/>
     <w:tmpl w:val="19ECDD02"/>
@@ -15113,7 +15036,7 @@
       </w:pPr>
     </w:lvl>
   </w:abstractNum>
-  <w:abstractNum w:abstractNumId="13" w15:restartNumberingAfterBreak="0">
+  <w:abstractNum w:abstractNumId="14" w15:restartNumberingAfterBreak="0">
     <w:nsid w:val="72A32108"/>
     <w:multiLevelType w:val="multilevel"/>
     <w:tmpl w:val="3BF4930E"/>
@@ -15233,45 +15156,48 @@
     </w:lvl>
   </w:abstractNum>
   <w:num w:numId="1" w16cid:durableId="1427340437">
-    <w:abstractNumId w:val="4"/>
+    <w:abstractNumId w:val="5"/>
   </w:num>
   <w:num w:numId="2" w16cid:durableId="1284341217">
-    <w:abstractNumId w:val="8"/>
+    <w:abstractNumId w:val="9"/>
   </w:num>
   <w:num w:numId="3" w16cid:durableId="1619144696">
     <w:abstractNumId w:val="1"/>
   </w:num>
   <w:num w:numId="4" w16cid:durableId="1435396935">
+    <w:abstractNumId w:val="14"/>
+  </w:num>
+  <w:num w:numId="5" w16cid:durableId="10962791">
+    <w:abstractNumId w:val="10"/>
+  </w:num>
+  <w:num w:numId="6" w16cid:durableId="412631479">
     <w:abstractNumId w:val="13"/>
   </w:num>
-  <w:num w:numId="5" w16cid:durableId="10962791">
-    <w:abstractNumId w:val="9"/>
-  </w:num>
-  <w:num w:numId="6" w16cid:durableId="412631479">
-    <w:abstractNumId w:val="12"/>
-  </w:num>
   <w:num w:numId="7" w16cid:durableId="1298415793">
-    <w:abstractNumId w:val="10"/>
+    <w:abstractNumId w:val="11"/>
   </w:num>
   <w:num w:numId="8" w16cid:durableId="23293449">
-    <w:abstractNumId w:val="6"/>
+    <w:abstractNumId w:val="7"/>
   </w:num>
   <w:num w:numId="9" w16cid:durableId="1983846038">
-    <w:abstractNumId w:val="7"/>
+    <w:abstractNumId w:val="8"/>
   </w:num>
   <w:num w:numId="10" w16cid:durableId="1749572173">
-    <w:abstractNumId w:val="5"/>
+    <w:abstractNumId w:val="6"/>
   </w:num>
   <w:num w:numId="11" w16cid:durableId="518546610">
     <w:abstractNumId w:val="0"/>
   </w:num>
   <w:num w:numId="12" w16cid:durableId="2068608344">
+    <w:abstractNumId w:val="4"/>
+  </w:num>
+  <w:num w:numId="13" w16cid:durableId="1133140410">
+    <w:abstractNumId w:val="12"/>
+  </w:num>
+  <w:num w:numId="14" w16cid:durableId="1313750814">
     <w:abstractNumId w:val="3"/>
   </w:num>
-  <w:num w:numId="13" w16cid:durableId="1133140410">
-    <w:abstractNumId w:val="11"/>
-  </w:num>
-  <w:num w:numId="14" w16cid:durableId="1313750814">
+  <w:num w:numId="15" w16cid:durableId="157694332">
     <w:abstractNumId w:val="2"/>
   </w:num>
   <w:numIdMacAtCleanup w:val="13"/>

</xml_diff>